<commit_message>
Add core marketplace flows and db sanity tooling
</commit_message>
<xml_diff>
--- a/docs/generated/demo-bk-demo-002.docx
+++ b/docs/generated/demo-bk-demo-002.docx
@@ -77,7 +77,7 @@
           <w:szCs w:val="20"/>
           <w:rtl w:val="0"/>
         </w:rPr>
-        <w:t xml:space="preserve">Contrat n° : CTR-BK-DEMO-002-20260522162153-1L1P     Date : 22/05/2026</w:t>
+        <w:t xml:space="preserve">Contrat n° : CTR-BK-DEMO-002-20260525175902-7LGR     Date : 05/25/2026</w:t>
       </w:r>
       <w:r>
         <w:rPr>
@@ -1787,7 +1787,7 @@
                 <w:szCs w:val="22"/>
                 <w:rtl w:val="0"/>
               </w:rPr>
-              <w:t xml:space="preserve">Loyer mensuel (TTC) : 95,00 €</w:t>
+              <w:t xml:space="preserve">Loyer mensuel (TTC) : 95.00 €</w:t>
             </w:r>
             <w:r>
               <w:rPr>

</xml_diff>